<commit_message>
prereg & topics for meeting
Cleaned up RQs for pre reg a little. Added topics for upcoming meeting in meetings_notes.txt
</commit_message>
<xml_diff>
--- a/preregistration/preregistration.docx
+++ b/preregistration/preregistration.docx
@@ -30,32 +30,7 @@
       <w:pPr>
         <w:pStyle w:val="ListParagraph"/>
         <w:numPr>
-          <w:ilvl w:val="1"/>
-          <w:numId w:val="2"/>
-        </w:numPr>
-      </w:pPr>
-      <w:r>
-        <w:rPr>
-          <w:b/>
-          <w:bCs/>
-        </w:rPr>
-        <w:t>RHOTICS AND GEOGRAPHIC ORIGIN</w:t>
-      </w:r>
-      <w:r>
-        <w:t>: D</w:t>
-      </w:r>
-      <w:r>
-        <w:t>o L1</w:t>
-      </w:r>
-      <w:r>
-        <w:t xml:space="preserve"> Portuguese speakers in Newark pattern in rhotic realization with their population of origin?</w:t>
-      </w:r>
-    </w:p>
-    <w:p>
-      <w:pPr>
-        <w:pStyle w:val="ListParagraph"/>
-        <w:numPr>
-          <w:ilvl w:val="1"/>
+          <w:ilvl w:val="0"/>
           <w:numId w:val="2"/>
         </w:numPr>
       </w:pPr>
@@ -77,30 +52,16 @@
           <w:ilvl w:val="0"/>
           <w:numId w:val="2"/>
         </w:numPr>
-        <w:rPr>
-          <w:b/>
-          <w:bCs/>
-        </w:rPr>
-      </w:pPr>
-      <w:commentRangeStart w:id="0"/>
-      <w:r>
-        <w:rPr>
-          <w:b/>
-          <w:bCs/>
-        </w:rPr>
-        <w:t>SOCIAL NETWORK QUESTION</w:t>
-      </w:r>
-      <w:commentRangeEnd w:id="0"/>
-      <w:r>
-        <w:rPr>
-          <w:rStyle w:val="CommentReference"/>
-          <w:sz w:val="24"/>
-          <w:szCs w:val="24"/>
-        </w:rPr>
-        <w:commentReference w:id="0"/>
-      </w:r>
-      <w:r>
-        <w:t xml:space="preserve">: </w:t>
+      </w:pPr>
+      <w:r>
+        <w:rPr>
+          <w:b/>
+          <w:bCs/>
+        </w:rPr>
+        <w:t>GEOGRAPHIC ORIGINS OF LUSOPHONES IN NEWARK</w:t>
+      </w:r>
+      <w:r>
+        <w:t>: What geographic origins does the lusophone population in Newark have?</w:t>
       </w:r>
     </w:p>
     <w:p>
@@ -110,16 +71,66 @@
           <w:ilvl w:val="0"/>
           <w:numId w:val="2"/>
         </w:numPr>
-      </w:pPr>
-      <w:r>
-        <w:rPr>
-          <w:b/>
-          <w:bCs/>
-        </w:rPr>
-        <w:t>GEOGRAPHIC ORIGINS OF LUSOPHONES IN NEWARK</w:t>
-      </w:r>
-      <w:r>
-        <w:t>: What geographic origins does the lusophone population in Newark have?</w:t>
+        <w:rPr>
+          <w:b/>
+          <w:bCs/>
+        </w:rPr>
+      </w:pPr>
+      <w:r>
+        <w:rPr>
+          <w:b/>
+          <w:bCs/>
+        </w:rPr>
+        <w:t xml:space="preserve">DIALECTAL CONTACT </w:t>
+      </w:r>
+      <w:commentRangeStart w:id="0"/>
+      <w:r>
+        <w:rPr>
+          <w:b/>
+          <w:bCs/>
+        </w:rPr>
+        <w:t>QUESTION</w:t>
+      </w:r>
+      <w:commentRangeEnd w:id="0"/>
+      <w:r>
+        <w:rPr>
+          <w:rStyle w:val="CommentReference"/>
+          <w:sz w:val="24"/>
+          <w:szCs w:val="24"/>
+        </w:rPr>
+        <w:commentReference w:id="0"/>
+      </w:r>
+      <w:r>
+        <w:t xml:space="preserve">: </w:t>
+      </w:r>
+      <w:r>
+        <w:t>To what extend do Portuguese speakers in Newark report contact with speakers of other varieties of Portuguese?</w:t>
+      </w:r>
+    </w:p>
+    <w:p>
+      <w:pPr>
+        <w:pStyle w:val="ListParagraph"/>
+        <w:numPr>
+          <w:ilvl w:val="0"/>
+          <w:numId w:val="2"/>
+        </w:numPr>
+        <w:rPr>
+          <w:b/>
+          <w:bCs/>
+        </w:rPr>
+      </w:pPr>
+      <w:r>
+        <w:rPr>
+          <w:b/>
+          <w:bCs/>
+        </w:rPr>
+        <w:t>DIALECTAL CONTACT ON RHOTICS</w:t>
+      </w:r>
+      <w:r>
+        <w:t xml:space="preserve">: </w:t>
+      </w:r>
+      <w:r>
+        <w:t>How does reported contact with speakers of different Portuguese varieties relate to patterns of rhotic production/production of other linguistic variables among Portuguese speakers in Newark, New Jersey?</w:t>
       </w:r>
     </w:p>
     <w:p/>
@@ -192,7 +203,11 @@
         </w:numPr>
       </w:pPr>
       <w:r>
-        <w:t>Quasi-experimental design: The strategy to identify or estimate a causal relationship takes advantage of some particular feature(s) or circumstance(s) that helps avoid much of the need for adjustment or control variables. This may include instrumental variables, "natural" experiments, interrupted time series designs, difference-in-difference designs, synthetic controls, or related approaches.</w:t>
+        <w:t xml:space="preserve">Quasi-experimental design: The strategy to identify or estimate a causal relationship takes advantage of some particular feature(s) or circumstance(s) that helps avoid much of the need for adjustment or control variables. This may include instrumental </w:t>
+      </w:r>
+      <w:r>
+        <w:lastRenderedPageBreak/>
+        <w:t>variables, "natural" experiments, interrupted time series designs, difference-in-difference designs, synthetic controls, or related approaches.</w:t>
       </w:r>
     </w:p>
     <w:p>
@@ -208,7 +223,6 @@
           <w:b/>
           <w:bCs/>
         </w:rPr>
-        <w:lastRenderedPageBreak/>
         <w:t>Descriptive study</w:t>
       </w:r>
       <w:r>
@@ -631,7 +645,6 @@
     </w:p>
     <w:p>
       <w:r>
-        <w:lastRenderedPageBreak/>
         <w:t>Describe your study design in sufficient detail for a reader to understand how the conditions or treatments are administered and how the measures and outcomes are assessed. Be specific about the parameters of the design such as: two-group, factorial, randomized block, or repeated measures. Clarify which parts of the design are between-subject (unpaired), within-subject (paired), or mixed. Describe counterbalancing. If your design is too complex to express in the response box, then upload a pdf providing a full description of the design and use the response box to summarize it or refer the reader to the file.</w:t>
       </w:r>
     </w:p>
@@ -708,6 +721,18 @@
         <w:t xml:space="preserve"> Participants will complete the Bilingual Language Profile in English or Portuguese as desired (</w:t>
       </w:r>
       <w:r>
+        <w:t>Birdsong</w:t>
+      </w:r>
+      <w:r>
+        <w:t xml:space="preserve"> </w:t>
+      </w:r>
+      <w:r>
+        <w:t xml:space="preserve">et al., </w:t>
+      </w:r>
+      <w:r>
+        <w:t xml:space="preserve">2012; </w:t>
+      </w:r>
+      <w:r>
         <w:t>Gertken, Amengual &amp; Birdsong,</w:t>
       </w:r>
       <w:r>
@@ -725,23 +750,52 @@
           <w:numId w:val="4"/>
         </w:numPr>
       </w:pPr>
+      <w:r>
+        <w:rPr>
+          <w:b/>
+          <w:bCs/>
+          <w:lang w:val="fr-FR"/>
+        </w:rPr>
+        <w:t>Dialectal Contact</w:t>
+      </w:r>
       <w:commentRangeStart w:id="1"/>
       <w:r>
         <w:rPr>
           <w:b/>
           <w:bCs/>
-        </w:rPr>
-        <w:t>Social network questionnaire.</w:t>
+          <w:lang w:val="fr-FR"/>
+        </w:rPr>
+        <w:t xml:space="preserve"> questionnaire.</w:t>
       </w:r>
       <w:commentRangeEnd w:id="1"/>
       <w:r>
         <w:rPr>
           <w:rStyle w:val="CommentReference"/>
+          <w:b/>
+          <w:bCs/>
           <w:sz w:val="24"/>
           <w:szCs w:val="24"/>
+          <w:lang w:val="fr-FR"/>
         </w:rPr>
         <w:commentReference w:id="1"/>
       </w:r>
+      <w:r>
+        <w:rPr>
+          <w:b/>
+          <w:bCs/>
+          <w:lang w:val="fr-FR"/>
+        </w:rPr>
+        <w:t xml:space="preserve"> </w:t>
+      </w:r>
+      <w:r>
+        <w:t xml:space="preserve">Participants will </w:t>
+      </w:r>
+      <w:r>
+        <w:t xml:space="preserve">report </w:t>
+      </w:r>
+      <w:r>
+        <w:t>the quantity of contact they have with different varieties of Portuguese and where that contact occurs.</w:t>
+      </w:r>
     </w:p>
     <w:p>
       <w:pPr>
@@ -765,7 +819,11 @@
     </w:p>
     <w:p>
       <w:r>
-        <w:t>Participants will be recruited primarily through flyers in Portuguese posted in Newark and snowball sampling. The flyer (with its English translation) is attached. Flyers will be posted in culturally-relevant spots that are frequented by Portuguese speakers, such as cafes and social clubs.</w:t>
+        <w:t xml:space="preserve">Participants will be recruited primarily through flyers in Portuguese posted in Newark and snowball sampling. The flyer (with its English translation) is attached. Flyers will be posted </w:t>
+      </w:r>
+      <w:r>
+        <w:lastRenderedPageBreak/>
+        <w:t>in culturally-relevant spots that are frequented by Portuguese speakers, such as cafes and social clubs.</w:t>
       </w:r>
     </w:p>
     <w:p>
@@ -797,115 +855,115 @@
           <w:szCs w:val="20"/>
         </w:rPr>
         <w:br/>
-        <w:t xml:space="preserve">All speakers of Portuguese who are over the age of 18, have the capacity to consent, live in New </w:t>
-      </w:r>
-      <w:r>
-        <w:rPr>
-          <w:rFonts w:ascii="Palatino Linotype" w:hAnsi="Palatino Linotype"/>
-          <w:color w:val="000000" w:themeColor="text1"/>
-          <w:sz w:val="20"/>
-          <w:szCs w:val="20"/>
-        </w:rPr>
+        <w:t>All speakers of Portuguese who are over the age of 18, have the capacity to consent, live in New Jersey or have substantial ties to a Portuguese-speaking community in New Jersey, and can participate in the study procedures are eligible to participate. Potential participants will be screened for these criteria by study personnel.</w:t>
+      </w:r>
+    </w:p>
+    <w:p>
+      <w:pPr>
+        <w:rPr>
+          <w:b/>
+          <w:bCs/>
+        </w:rPr>
+      </w:pPr>
+      <w:r>
+        <w:rPr>
+          <w:b/>
+          <w:bCs/>
+        </w:rPr>
+        <w:t>Sample size</w:t>
+      </w:r>
+    </w:p>
+    <w:p>
+      <w:r>
+        <w:t>Describe the sample size for each unit of analysis, including noting whether the sample size is expected to be the same across conditions, treatments or clusters, or describe the planned sample sizes for each condition, treatment, or cluster. If there is a multi-level or mixed design, describe the sample size at each level and any details needed to understand the nesting of sample sizes across levels.</w:t>
+      </w:r>
+    </w:p>
+    <w:p>
+      <w:r>
+        <w:t>We aim to collect data from a minimum of 30 participants.</w:t>
+      </w:r>
+    </w:p>
+    <w:p>
+      <w:pPr>
+        <w:rPr>
+          <w:b/>
+          <w:bCs/>
+        </w:rPr>
+      </w:pPr>
+      <w:r>
+        <w:rPr>
+          <w:b/>
+          <w:bCs/>
+        </w:rPr>
+        <w:t>Sample size rationale (Optional)</w:t>
+      </w:r>
+    </w:p>
+    <w:p>
+      <w:r>
+        <w:t>Explain the basis for the planned sample size such as a power analysis, arbitrary constraint (time, money), or pre-specified decision rule for bayesian or other responsive designs.</w:t>
+      </w:r>
+    </w:p>
+    <w:p>
+      <w:r>
+        <w:t>The sample size rationale is based on previous sample sizes from similar studies (Rennicke, 2015).</w:t>
+      </w:r>
+    </w:p>
+    <w:p>
+      <w:pPr>
+        <w:rPr>
+          <w:b/>
+          <w:bCs/>
+        </w:rPr>
+      </w:pPr>
+      <w:r>
+        <w:rPr>
+          <w:b/>
+          <w:bCs/>
+        </w:rPr>
+        <w:t>Starting and stopping rules</w:t>
+      </w:r>
+    </w:p>
+    <w:p>
+      <w:r>
+        <w:t>For studies generating new data or research using a portion of a larger existing dataset, specify how you will decide when pilot testing ends and data collection for the study begins, and how you will decide when to terminate data collection.</w:t>
+      </w:r>
+    </w:p>
+    <w:p>
+      <w:r>
+        <w:t xml:space="preserve">Pilot testing will include up to and including the fifth participant. The sixth participant and beyond will constitute data collection. </w:t>
+      </w:r>
+      <w:r>
+        <w:t>Data collection will terminate in January 2027 if data from the minimum number of participants, 30, has been collected. If the minimum number has not been found, data collection will continue into 2027</w:t>
+      </w:r>
+      <w:r>
+        <w:t xml:space="preserve"> until data from at least 30 participants has been collected</w:t>
+      </w:r>
+      <w:r>
+        <w:t>. During the data collection period, from September 2026 to January 2027, there will be no restriction on maximum number of participants.</w:t>
+      </w:r>
+    </w:p>
+    <w:p>
+      <w:pPr>
+        <w:rPr>
+          <w:b/>
+          <w:bCs/>
+        </w:rPr>
+      </w:pPr>
+      <w:r>
+        <w:rPr>
+          <w:b/>
+          <w:bCs/>
+        </w:rPr>
+        <w:t>Manipulated variables</w:t>
+      </w:r>
+    </w:p>
+    <w:p>
+      <w:r>
+        <w:t xml:space="preserve">Describe all manipulated variables and the levels or treatment arms. If the investigation has no randomization, then respond none. If your manipulated variables are too complex to </w:t>
+      </w:r>
+      <w:r>
         <w:lastRenderedPageBreak/>
-        <w:t>Jersey or have substantial ties to a Portuguese-speaking community in New Jersey, and can participate in the study procedures are eligible to participate. Potential participants will be screened for these criteria by study personnel.</w:t>
-      </w:r>
-    </w:p>
-    <w:p>
-      <w:pPr>
-        <w:rPr>
-          <w:b/>
-          <w:bCs/>
-        </w:rPr>
-      </w:pPr>
-      <w:r>
-        <w:rPr>
-          <w:b/>
-          <w:bCs/>
-        </w:rPr>
-        <w:t>Sample size</w:t>
-      </w:r>
-    </w:p>
-    <w:p>
-      <w:r>
-        <w:t>Describe the sample size for each unit of analysis, including noting whether the sample size is expected to be the same across conditions, treatments or clusters, or describe the planned sample sizes for each condition, treatment, or cluster. If there is a multi-level or mixed design, describe the sample size at each level and any details needed to understand the nesting of sample sizes across levels.</w:t>
-      </w:r>
-    </w:p>
-    <w:p>
-      <w:r>
-        <w:t>We aim to collect data from a minimum of 30 participants.</w:t>
-      </w:r>
-    </w:p>
-    <w:p>
-      <w:pPr>
-        <w:rPr>
-          <w:b/>
-          <w:bCs/>
-        </w:rPr>
-      </w:pPr>
-      <w:r>
-        <w:rPr>
-          <w:b/>
-          <w:bCs/>
-        </w:rPr>
-        <w:t>Sample size rationale (Optional)</w:t>
-      </w:r>
-    </w:p>
-    <w:p>
-      <w:r>
-        <w:t>Explain the basis for the planned sample size such as a power analysis, arbitrary constraint (time, money), or pre-specified decision rule for bayesian or other responsive designs.</w:t>
-      </w:r>
-    </w:p>
-    <w:p>
-      <w:r>
-        <w:t>The sample size rationale is based on previous sample sizes from similar studies (Rennicke, 2015).</w:t>
-      </w:r>
-    </w:p>
-    <w:p>
-      <w:pPr>
-        <w:rPr>
-          <w:b/>
-          <w:bCs/>
-        </w:rPr>
-      </w:pPr>
-      <w:r>
-        <w:rPr>
-          <w:b/>
-          <w:bCs/>
-        </w:rPr>
-        <w:t>Starting and stopping rules</w:t>
-      </w:r>
-    </w:p>
-    <w:p>
-      <w:r>
-        <w:t>For studies generating new data or research using a portion of a larger existing dataset, specify how you will decide when pilot testing ends and data collection for the study begins, and how you will decide when to terminate data collection.</w:t>
-      </w:r>
-    </w:p>
-    <w:p>
-      <w:r>
-        <w:t xml:space="preserve">Pilot testing will include up to and including the fifth participant. The sixth participant and beyond will constitute data collection. </w:t>
-      </w:r>
-      <w:r>
-        <w:t>Data collection will terminate in January 2027 if data from the minimum number of participants, 30, has been collected. If the minimum number has not been found, data collection will continue into 2027. During the data collection period, from September 2026 to January 2027, there will be no restriction on maximum number of participants.</w:t>
-      </w:r>
-    </w:p>
-    <w:p>
-      <w:pPr>
-        <w:rPr>
-          <w:b/>
-          <w:bCs/>
-        </w:rPr>
-      </w:pPr>
-      <w:r>
-        <w:rPr>
-          <w:b/>
-          <w:bCs/>
-        </w:rPr>
-        <w:t>Manipulated variables</w:t>
-      </w:r>
-    </w:p>
-    <w:p>
-      <w:r>
-        <w:t>Describe all manipulated variables and the levels or treatment arms. If the investigation has no randomization, then respond none. If your manipulated variables are too complex to express in the response box, then upload a pdf providing a full description and use the response box to summarize it or refer the reader to the file.</w:t>
+        <w:t>express in the response box, then upload a pdf providing a full description and use the response box to summarize it or refer the reader to the file.</w:t>
       </w:r>
     </w:p>
     <w:p>
@@ -930,7 +988,6 @@
     </w:p>
     <w:p>
       <w:r>
-        <w:lastRenderedPageBreak/>
         <w:t>Describe all measured variables including outcome measures, predictors in observational studies, covariates, and variables that could be used for subsetting or excluding observations. If your measured variables are too complex to express in the response box, then upload a pdf providing a full description and use the response box to summarize it or refer the reader to the file.</w:t>
       </w:r>
     </w:p>
@@ -1175,12 +1232,12 @@
     </w:p>
     <w:p>
       <w:r>
+        <w:lastRenderedPageBreak/>
         <w:t>Describe how measured variables will be combined into indices or derived variables. Include a formula or precise description of the method of creating the derived variable. If your indices or derived variables are too complex to express in the response box, then upload a pdf providing a full description and use the response box to summarize it or refer the reader to the file.</w:t>
       </w:r>
     </w:p>
     <w:p>
       <w:r>
-        <w:lastRenderedPageBreak/>
         <w:t>INCLUDE BLP SCORER HERE.</w:t>
       </w:r>
     </w:p>
@@ -1471,7 +1528,6 @@
     </w:p>
     <w:p>
       <w:r>
-        <w:lastRenderedPageBreak/>
         <w:t>Describe all criteria that will be used to determine which data or subjects will be included or excluded. Describe how outliers will be handled. If there are no criteria, and all observations and subjects will be used, say so.</w:t>
       </w:r>
     </w:p>
@@ -1621,6 +1677,12 @@
     </w:p>
     <w:p>
       <w:r>
+        <w:t>Birdsong, D., Gertken, L. M., &amp; Amengual, M. (2012). Bilingual Language Profile: An easy-to-use instrument to assess bilingualism. COERLL, University of Texas at Austin. Web. 20 Jan. 2012.</w:t>
+      </w:r>
+    </w:p>
+    <w:p>
+      <w:r>
+        <w:lastRenderedPageBreak/>
         <w:t>Gertken, L. M., Amengual, M., &amp; Birdsong, D. (2014). 11. assessing language dominance with the bilingual language profile. </w:t>
       </w:r>
       <w:r>
@@ -1664,7 +1726,6 @@
     </w:p>
     <w:p>
       <w:r>
-        <w:lastRenderedPageBreak/>
         <w:t>Hurtado, I. (2022, June). BILinMID: A spanish-english corpus of the US midwest. In </w:t>
       </w:r>
       <w:r>
@@ -2629,8 +2690,8 @@
   <w:abstractNum w:abstractNumId="6" w15:restartNumberingAfterBreak="0">
     <w:nsid w:val="68C80591"/>
     <w:multiLevelType w:val="hybridMultilevel"/>
-    <w:tmpl w:val="7EECCBB0"/>
-    <w:lvl w:ilvl="0" w:tplc="0409000F">
+    <w:tmpl w:val="423A1EF4"/>
+    <w:lvl w:ilvl="0" w:tplc="FF1A5538">
       <w:start w:val="1"/>
       <w:numFmt w:val="decimal"/>
       <w:lvlText w:val="%1."/>
@@ -2638,6 +2699,10 @@
       <w:pPr>
         <w:ind w:left="720" w:hanging="360"/>
       </w:pPr>
+      <w:rPr>
+        <w:b w:val="0"/>
+        <w:bCs w:val="0"/>
+      </w:rPr>
     </w:lvl>
     <w:lvl w:ilvl="1" w:tplc="04090019">
       <w:start w:val="1"/>
@@ -3346,7 +3411,6 @@
   <w:style w:type="character" w:default="1" w:styleId="DefaultParagraphFont">
     <w:name w:val="Default Paragraph Font"/>
     <w:uiPriority w:val="1"/>
-    <w:semiHidden/>
     <w:unhideWhenUsed/>
   </w:style>
   <w:style w:type="table" w:default="1" w:styleId="TableNormal">
@@ -3738,7 +3802,6 @@
     <w:basedOn w:val="Normal"/>
     <w:link w:val="CommentTextChar"/>
     <w:uiPriority w:val="99"/>
-    <w:semiHidden/>
     <w:unhideWhenUsed/>
     <w:rsid w:val="00932F52"/>
     <w:pPr>
@@ -3754,7 +3817,6 @@
     <w:basedOn w:val="DefaultParagraphFont"/>
     <w:link w:val="CommentText"/>
     <w:uiPriority w:val="99"/>
-    <w:semiHidden/>
     <w:rsid w:val="00932F52"/>
     <w:rPr>
       <w:sz w:val="20"/>

</xml_diff>